<commit_message>
Add official live Vercel production domains to submission documents and README
</commit_message>
<xml_diff>
--- a/Task_13_Submission_NovaPulse_AI_anuu7.docx
+++ b/Task_13_Submission_NovaPulse_AI_anuu7.docx
@@ -184,7 +184,7 @@
         <w:br/>
         <w:t>• js/app.js: Modular zero-dependency JavaScript engine managing themes, navigation, calculators, pricing switches, search filtering, and local data persistence.</w:t>
         <w:br/>
-        <w:t>• vercel.json &amp; netlify.toml: Production deployment configurations with HTTP security headers.</w:t>
+        <w:t>• netlify.toml: Production headers and deployment configurations.</w:t>
       </w:r>
     </w:p>
     <w:p>
@@ -200,6 +200,36 @@
         <w:rPr>
           <w:b/>
         </w:rPr>
+        <w:t xml:space="preserve">• Primary Live Production Website (Vercel): </w:t>
+      </w:r>
+      <w:r>
+        <w:t>https://novapulse-ai-seven.vercel.app/</w:t>
+        <w:br/>
+      </w:r>
+      <w:r>
+        <w:rPr>
+          <w:b/>
+        </w:rPr>
+        <w:t xml:space="preserve">• Branch Deployment URL (Git Main): </w:t>
+      </w:r>
+      <w:r>
+        <w:t>https://novapulse-ai-git-main-a7-web-and-craft.vercel.app/</w:t>
+        <w:br/>
+      </w:r>
+      <w:r>
+        <w:rPr>
+          <w:b/>
+        </w:rPr>
+        <w:t xml:space="preserve">• Deployment Instance URL: </w:t>
+      </w:r>
+      <w:r>
+        <w:t>https://novapulse-nvlaf0dw7-a7-web-and-craft.vercel.app/</w:t>
+        <w:br/>
+      </w:r>
+      <w:r>
+        <w:rPr>
+          <w:b/>
+        </w:rPr>
         <w:t xml:space="preserve">• GitHub Repository Link: </w:t>
       </w:r>
       <w:r>
@@ -210,20 +240,10 @@
         <w:rPr>
           <w:b/>
         </w:rPr>
-        <w:t xml:space="preserve">• Live Production Website Link (Vercel): </w:t>
-      </w:r>
-      <w:r>
-        <w:t>https://novapulse-ai.vercel.app (or https://novapulse-ai-anuu7.vercel.app)</w:t>
-        <w:br/>
-      </w:r>
-      <w:r>
-        <w:rPr>
-          <w:b/>
-        </w:rPr>
         <w:t xml:space="preserve">• Deployment Pipeline: </w:t>
       </w:r>
       <w:r>
-        <w:t>Continuous Deployment via GitHub -&gt; Vercel Integration (Automatic production builds on git push)</w:t>
+        <w:t>Continuous Deployment via GitHub -&gt; Vercel (Automatic production builds on git push)</w:t>
       </w:r>
     </w:p>
     <w:p>

</xml_diff>